<commit_message>
movida de lugar la documentacion
</commit_message>
<xml_diff>
--- a/Documentation/Guia De Programacion.docx
+++ b/Documentation/Guia De Programacion.docx
@@ -26,224 +26,104 @@
         <w:rPr>
           <w:lang w:val="es-AR"/>
         </w:rPr>
-        <w:t xml:space="preserve"> Programación</w:t>
-      </w:r>
-      <w:r>
-        <w:rPr>
-          <w:lang w:val="es-AR"/>
-        </w:rPr>
         <w:t xml:space="preserve"> </w:t>
       </w:r>
-    </w:p>
-    <w:p>
-      <w:pPr>
-        <w:jc w:val="both"/>
-        <w:rPr>
-          <w:lang w:val="es-AR"/>
-        </w:rPr>
-      </w:pPr>
-    </w:p>
-    <w:p>
-      <w:pPr>
-        <w:pStyle w:val="Heading1"/>
-        <w:jc w:val="both"/>
-        <w:rPr>
-          <w:color w:val="000000" w:themeColor="text1"/>
-          <w:lang w:val="es-AR"/>
-          <w14:textOutline w14:w="0" w14:cap="flat" w14:cmpd="sng" w14:algn="ctr">
-            <w14:noFill/>
-            <w14:prstDash w14:val="solid"/>
-            <w14:round/>
-          </w14:textOutline>
-        </w:rPr>
-      </w:pPr>
-      <w:r>
-        <w:rPr>
-          <w:color w:val="000000" w:themeColor="text1"/>
-          <w:lang w:val="es-AR"/>
-          <w14:textOutline w14:w="0" w14:cap="flat" w14:cmpd="sng" w14:algn="ctr">
-            <w14:noFill/>
-            <w14:prstDash w14:val="solid"/>
-            <w14:round/>
-          </w14:textOutline>
-        </w:rPr>
-        <w:t>Estructura de l</w:t>
-      </w:r>
-      <w:r>
-        <w:rPr>
-          <w:color w:val="000000" w:themeColor="text1"/>
-          <w:lang w:val="es-AR"/>
-          <w14:textOutline w14:w="0" w14:cap="flat" w14:cmpd="sng" w14:algn="ctr">
-            <w14:noFill/>
-            <w14:prstDash w14:val="solid"/>
-            <w14:round/>
-          </w14:textOutline>
-        </w:rPr>
-        <w:t>as</w:t>
-      </w:r>
-      <w:r>
-        <w:rPr>
-          <w:color w:val="000000" w:themeColor="text1"/>
-          <w:lang w:val="es-AR"/>
-          <w14:textOutline w14:w="0" w14:cap="flat" w14:cmpd="sng" w14:algn="ctr">
-            <w14:noFill/>
-            <w14:prstDash w14:val="solid"/>
-            <w14:round/>
-          </w14:textOutline>
-        </w:rPr>
-        <w:t xml:space="preserve"> </w:t>
-      </w:r>
-      <w:r>
-        <w:rPr>
-          <w:color w:val="000000" w:themeColor="text1"/>
-          <w:lang w:val="es-AR"/>
-          <w14:textOutline w14:w="0" w14:cap="flat" w14:cmpd="sng" w14:algn="ctr">
-            <w14:noFill/>
-            <w14:prstDash w14:val="solid"/>
-            <w14:round/>
-          </w14:textOutline>
-        </w:rPr>
-        <w:t>C</w:t>
-      </w:r>
-      <w:r>
-        <w:rPr>
-          <w:color w:val="000000" w:themeColor="text1"/>
-          <w:lang w:val="es-AR"/>
-          <w14:textOutline w14:w="0" w14:cap="flat" w14:cmpd="sng" w14:algn="ctr">
-            <w14:noFill/>
-            <w14:prstDash w14:val="solid"/>
-            <w14:round/>
-          </w14:textOutline>
-        </w:rPr>
-        <w:t>lases</w:t>
-      </w:r>
-      <w:r>
-        <w:rPr>
-          <w:color w:val="000000" w:themeColor="text1"/>
-          <w:lang w:val="es-AR"/>
-          <w14:textOutline w14:w="0" w14:cap="flat" w14:cmpd="sng" w14:algn="ctr">
-            <w14:noFill/>
-            <w14:prstDash w14:val="solid"/>
-            <w14:round/>
-          </w14:textOutline>
-        </w:rPr>
-        <w:t>:</w:t>
-      </w:r>
-    </w:p>
-    <w:p>
-      <w:pPr>
-        <w:jc w:val="both"/>
-        <w:rPr>
-          <w:lang w:val="es-AR"/>
-        </w:rPr>
-      </w:pPr>
-    </w:p>
-    <w:p>
-      <w:pPr>
-        <w:jc w:val="both"/>
-        <w:rPr>
-          <w:lang w:val="en-US"/>
-        </w:rPr>
-      </w:pPr>
-      <w:r>
-        <w:rPr>
-          <w:lang w:val="en-US"/>
-        </w:rPr>
-        <w:t>‘</w:t>
-      </w:r>
-      <w:proofErr w:type="spellStart"/>
-      <w:proofErr w:type="gramStart"/>
-      <w:r>
-        <w:rPr>
-          <w:lang w:val="en-US"/>
-        </w:rPr>
-        <w:t>pyreverse</w:t>
-      </w:r>
-      <w:proofErr w:type="spellEnd"/>
-      <w:proofErr w:type="gramEnd"/>
-      <w:r>
-        <w:rPr>
-          <w:lang w:val="en-US"/>
-        </w:rPr>
-        <w:t xml:space="preserve"> -o </w:t>
-      </w:r>
-      <w:proofErr w:type="spellStart"/>
-      <w:r>
-        <w:rPr>
-          <w:lang w:val="en-US"/>
-        </w:rPr>
-        <w:t>png</w:t>
-      </w:r>
-      <w:proofErr w:type="spellEnd"/>
-      <w:r>
-        <w:rPr>
-          <w:lang w:val="en-US"/>
-        </w:rPr>
-        <w:t xml:space="preserve"> -p Microscopy -</w:t>
-      </w:r>
-      <w:proofErr w:type="spellStart"/>
-      <w:r>
-        <w:rPr>
-          <w:lang w:val="en-US"/>
-        </w:rPr>
-        <w:t>Smy</w:t>
-      </w:r>
-      <w:proofErr w:type="spellEnd"/>
-      <w:r>
-        <w:rPr>
-          <w:lang w:val="en-US"/>
-        </w:rPr>
-        <w:t xml:space="preserve"> View\program_window.py</w:t>
-      </w:r>
-      <w:r>
-        <w:rPr>
-          <w:lang w:val="en-US"/>
-        </w:rPr>
-        <w:t>’</w:t>
-      </w:r>
-    </w:p>
-    <w:p>
-      <w:pPr>
-        <w:jc w:val="both"/>
-        <w:rPr>
-          <w:lang w:val="en-US"/>
-        </w:rPr>
-      </w:pPr>
       <w:bookmarkStart w:id="0" w:name="_GoBack"/>
       <w:bookmarkEnd w:id="0"/>
+      <w:r>
+        <w:rPr>
+          <w:lang w:val="es-AR"/>
+        </w:rPr>
+        <w:t>Programación</w:t>
+      </w:r>
+      <w:r>
+        <w:rPr>
+          <w:lang w:val="es-AR"/>
+        </w:rPr>
+        <w:t xml:space="preserve"> </w:t>
+      </w:r>
+    </w:p>
+    <w:p>
+      <w:pPr>
+        <w:rPr>
+          <w:lang w:val="es-AR"/>
+        </w:rPr>
+      </w:pPr>
+    </w:p>
+    <w:p>
+      <w:pPr>
+        <w:rPr>
+          <w:lang w:val="es-AR"/>
+        </w:rPr>
+      </w:pPr>
+    </w:p>
+    <w:p>
+      <w:pPr>
+        <w:rPr>
+          <w:lang w:val="es-AR"/>
+        </w:rPr>
+      </w:pPr>
+    </w:p>
+    <w:p>
+      <w:pPr>
+        <w:pStyle w:val="Heading1"/>
+      </w:pPr>
+      <w:r>
+        <w:t>Requerimientos:</w:t>
+      </w:r>
+    </w:p>
+    <w:p>
+      <w:pPr>
+        <w:rPr>
+          <w:lang w:val="es-AR"/>
+        </w:rPr>
+      </w:pPr>
+      <w:r>
+        <w:rPr>
+          <w:lang w:val="es-AR"/>
+        </w:rPr>
+        <w:t>Para desarrollar este proyecto es necesario</w:t>
+      </w:r>
+    </w:p>
+    <w:p>
+      <w:pPr>
+        <w:pStyle w:val="ListParagraph"/>
+        <w:numPr>
+          <w:ilvl w:val="0"/>
+          <w:numId w:val="3"/>
+        </w:numPr>
+        <w:rPr>
+          <w:lang w:val="es-AR"/>
+        </w:rPr>
+      </w:pPr>
+      <w:r>
+        <w:rPr>
+          <w:lang w:val="es-AR"/>
+        </w:rPr>
+        <w:t xml:space="preserve">Un conocimiento general de </w:t>
+      </w:r>
+      <w:proofErr w:type="spellStart"/>
+      <w:r>
+        <w:rPr>
+          <w:lang w:val="es-AR"/>
+        </w:rPr>
+        <w:t>python</w:t>
+      </w:r>
+      <w:proofErr w:type="spellEnd"/>
     </w:p>
     <w:p>
       <w:pPr>
         <w:jc w:val="both"/>
         <w:rPr>
-          <w:lang w:val="en-US"/>
+          <w:lang w:val="es-AR"/>
         </w:rPr>
       </w:pPr>
     </w:p>
     <w:p>
       <w:pPr>
         <w:pStyle w:val="Heading1"/>
-        <w:jc w:val="both"/>
-        <w:rPr>
-          <w:color w:val="000000" w:themeColor="text1"/>
-          <w:lang w:val="es-AR"/>
-          <w14:textOutline w14:w="0" w14:cap="flat" w14:cmpd="sng" w14:algn="ctr">
-            <w14:noFill/>
-            <w14:prstDash w14:val="solid"/>
-            <w14:round/>
-          </w14:textOutline>
-        </w:rPr>
-      </w:pPr>
-      <w:r>
-        <w:rPr>
-          <w:color w:val="000000" w:themeColor="text1"/>
-          <w:lang w:val="es-AR"/>
-          <w14:textOutline w14:w="0" w14:cap="flat" w14:cmpd="sng" w14:algn="ctr">
-            <w14:noFill/>
-            <w14:prstDash w14:val="solid"/>
-            <w14:round/>
-          </w14:textOutline>
-        </w:rPr>
+      </w:pPr>
+      <w:r>
         <w:t>Estructura de los Archivos:</w:t>
       </w:r>
     </w:p>
@@ -674,6 +554,118 @@
 <file path=word/numbering.xml><?xml version="1.0" encoding="utf-8"?>
 <w:numbering xmlns:wpc="http://schemas.microsoft.com/office/word/2010/wordprocessingCanvas" xmlns:cx="http://schemas.microsoft.com/office/drawing/2014/chartex" xmlns:cx1="http://schemas.microsoft.com/office/drawing/2015/9/8/chartex" xmlns:mc="http://schemas.openxmlformats.org/markup-compatibility/2006" xmlns:o="urn:schemas-microsoft-com:office:office" xmlns:r="http://schemas.openxmlformats.org/officeDocument/2006/relationships" xmlns:m="http://schemas.openxmlformats.org/officeDocument/2006/math" xmlns:v="urn:schemas-microsoft-com:vml" xmlns:wp14="http://schemas.microsoft.com/office/word/2010/wordprocessingDrawing" xmlns:wp="http://schemas.openxmlformats.org/drawingml/2006/wordprocessingDrawing" xmlns:w10="urn:schemas-microsoft-com:office:word" xmlns:w="http://schemas.openxmlformats.org/wordprocessingml/2006/main" xmlns:w14="http://schemas.microsoft.com/office/word/2010/wordml" xmlns:w15="http://schemas.microsoft.com/office/word/2012/wordml" xmlns:w16se="http://schemas.microsoft.com/office/word/2015/wordml/symex" xmlns:wpg="http://schemas.microsoft.com/office/word/2010/wordprocessingGroup" xmlns:wpi="http://schemas.microsoft.com/office/word/2010/wordprocessingInk" xmlns:wne="http://schemas.microsoft.com/office/word/2006/wordml" xmlns:wps="http://schemas.microsoft.com/office/word/2010/wordprocessingShape" mc:Ignorable="w14 w15 w16se wp14">
   <w:abstractNum w:abstractNumId="0" w15:restartNumberingAfterBreak="0">
+    <w:nsid w:val="059978BB"/>
+    <w:multiLevelType w:val="hybridMultilevel"/>
+    <w:tmpl w:val="537E57EC"/>
+    <w:lvl w:ilvl="0" w:tplc="5D7A9B38">
+      <w:numFmt w:val="bullet"/>
+      <w:lvlText w:val="-"/>
+      <w:lvlJc w:val="left"/>
+      <w:pPr>
+        <w:ind w:left="720" w:hanging="360"/>
+      </w:pPr>
+      <w:rPr>
+        <w:rFonts w:ascii="Calibri" w:eastAsiaTheme="minorHAnsi" w:hAnsi="Calibri" w:cs="Calibri" w:hint="default"/>
+      </w:rPr>
+    </w:lvl>
+    <w:lvl w:ilvl="1" w:tplc="2C0A0003" w:tentative="1">
+      <w:start w:val="1"/>
+      <w:numFmt w:val="bullet"/>
+      <w:lvlText w:val="o"/>
+      <w:lvlJc w:val="left"/>
+      <w:pPr>
+        <w:ind w:left="1440" w:hanging="360"/>
+      </w:pPr>
+      <w:rPr>
+        <w:rFonts w:ascii="Courier New" w:hAnsi="Courier New" w:cs="Courier New" w:hint="default"/>
+      </w:rPr>
+    </w:lvl>
+    <w:lvl w:ilvl="2" w:tplc="2C0A0005" w:tentative="1">
+      <w:start w:val="1"/>
+      <w:numFmt w:val="bullet"/>
+      <w:lvlText w:val=""/>
+      <w:lvlJc w:val="left"/>
+      <w:pPr>
+        <w:ind w:left="2160" w:hanging="360"/>
+      </w:pPr>
+      <w:rPr>
+        <w:rFonts w:ascii="Wingdings" w:hAnsi="Wingdings" w:hint="default"/>
+      </w:rPr>
+    </w:lvl>
+    <w:lvl w:ilvl="3" w:tplc="2C0A0001" w:tentative="1">
+      <w:start w:val="1"/>
+      <w:numFmt w:val="bullet"/>
+      <w:lvlText w:val=""/>
+      <w:lvlJc w:val="left"/>
+      <w:pPr>
+        <w:ind w:left="2880" w:hanging="360"/>
+      </w:pPr>
+      <w:rPr>
+        <w:rFonts w:ascii="Symbol" w:hAnsi="Symbol" w:hint="default"/>
+      </w:rPr>
+    </w:lvl>
+    <w:lvl w:ilvl="4" w:tplc="2C0A0003" w:tentative="1">
+      <w:start w:val="1"/>
+      <w:numFmt w:val="bullet"/>
+      <w:lvlText w:val="o"/>
+      <w:lvlJc w:val="left"/>
+      <w:pPr>
+        <w:ind w:left="3600" w:hanging="360"/>
+      </w:pPr>
+      <w:rPr>
+        <w:rFonts w:ascii="Courier New" w:hAnsi="Courier New" w:cs="Courier New" w:hint="default"/>
+      </w:rPr>
+    </w:lvl>
+    <w:lvl w:ilvl="5" w:tplc="2C0A0005" w:tentative="1">
+      <w:start w:val="1"/>
+      <w:numFmt w:val="bullet"/>
+      <w:lvlText w:val=""/>
+      <w:lvlJc w:val="left"/>
+      <w:pPr>
+        <w:ind w:left="4320" w:hanging="360"/>
+      </w:pPr>
+      <w:rPr>
+        <w:rFonts w:ascii="Wingdings" w:hAnsi="Wingdings" w:hint="default"/>
+      </w:rPr>
+    </w:lvl>
+    <w:lvl w:ilvl="6" w:tplc="2C0A0001" w:tentative="1">
+      <w:start w:val="1"/>
+      <w:numFmt w:val="bullet"/>
+      <w:lvlText w:val=""/>
+      <w:lvlJc w:val="left"/>
+      <w:pPr>
+        <w:ind w:left="5040" w:hanging="360"/>
+      </w:pPr>
+      <w:rPr>
+        <w:rFonts w:ascii="Symbol" w:hAnsi="Symbol" w:hint="default"/>
+      </w:rPr>
+    </w:lvl>
+    <w:lvl w:ilvl="7" w:tplc="2C0A0003" w:tentative="1">
+      <w:start w:val="1"/>
+      <w:numFmt w:val="bullet"/>
+      <w:lvlText w:val="o"/>
+      <w:lvlJc w:val="left"/>
+      <w:pPr>
+        <w:ind w:left="5760" w:hanging="360"/>
+      </w:pPr>
+      <w:rPr>
+        <w:rFonts w:ascii="Courier New" w:hAnsi="Courier New" w:cs="Courier New" w:hint="default"/>
+      </w:rPr>
+    </w:lvl>
+    <w:lvl w:ilvl="8" w:tplc="2C0A0005" w:tentative="1">
+      <w:start w:val="1"/>
+      <w:numFmt w:val="bullet"/>
+      <w:lvlText w:val=""/>
+      <w:lvlJc w:val="left"/>
+      <w:pPr>
+        <w:ind w:left="6480" w:hanging="360"/>
+      </w:pPr>
+      <w:rPr>
+        <w:rFonts w:ascii="Wingdings" w:hAnsi="Wingdings" w:hint="default"/>
+      </w:rPr>
+    </w:lvl>
+  </w:abstractNum>
+  <w:abstractNum w:abstractNumId="1" w15:restartNumberingAfterBreak="0">
     <w:nsid w:val="1C0A69AF"/>
     <w:multiLevelType w:val="hybridMultilevel"/>
     <w:tmpl w:val="15549076"/>
@@ -785,7 +777,125 @@
       </w:rPr>
     </w:lvl>
   </w:abstractNum>
+  <w:abstractNum w:abstractNumId="2" w15:restartNumberingAfterBreak="0">
+    <w:nsid w:val="265376E7"/>
+    <w:multiLevelType w:val="hybridMultilevel"/>
+    <w:tmpl w:val="6858982C"/>
+    <w:lvl w:ilvl="0" w:tplc="12082E94">
+      <w:numFmt w:val="bullet"/>
+      <w:lvlText w:val="-"/>
+      <w:lvlJc w:val="left"/>
+      <w:pPr>
+        <w:ind w:left="1080" w:hanging="360"/>
+      </w:pPr>
+      <w:rPr>
+        <w:rFonts w:ascii="Calibri" w:eastAsiaTheme="minorHAnsi" w:hAnsi="Calibri" w:cs="Calibri" w:hint="default"/>
+      </w:rPr>
+    </w:lvl>
+    <w:lvl w:ilvl="1" w:tplc="2C0A0003" w:tentative="1">
+      <w:start w:val="1"/>
+      <w:numFmt w:val="bullet"/>
+      <w:lvlText w:val="o"/>
+      <w:lvlJc w:val="left"/>
+      <w:pPr>
+        <w:ind w:left="1800" w:hanging="360"/>
+      </w:pPr>
+      <w:rPr>
+        <w:rFonts w:ascii="Courier New" w:hAnsi="Courier New" w:cs="Courier New" w:hint="default"/>
+      </w:rPr>
+    </w:lvl>
+    <w:lvl w:ilvl="2" w:tplc="2C0A0005" w:tentative="1">
+      <w:start w:val="1"/>
+      <w:numFmt w:val="bullet"/>
+      <w:lvlText w:val=""/>
+      <w:lvlJc w:val="left"/>
+      <w:pPr>
+        <w:ind w:left="2520" w:hanging="360"/>
+      </w:pPr>
+      <w:rPr>
+        <w:rFonts w:ascii="Wingdings" w:hAnsi="Wingdings" w:hint="default"/>
+      </w:rPr>
+    </w:lvl>
+    <w:lvl w:ilvl="3" w:tplc="2C0A0001" w:tentative="1">
+      <w:start w:val="1"/>
+      <w:numFmt w:val="bullet"/>
+      <w:lvlText w:val=""/>
+      <w:lvlJc w:val="left"/>
+      <w:pPr>
+        <w:ind w:left="3240" w:hanging="360"/>
+      </w:pPr>
+      <w:rPr>
+        <w:rFonts w:ascii="Symbol" w:hAnsi="Symbol" w:hint="default"/>
+      </w:rPr>
+    </w:lvl>
+    <w:lvl w:ilvl="4" w:tplc="2C0A0003" w:tentative="1">
+      <w:start w:val="1"/>
+      <w:numFmt w:val="bullet"/>
+      <w:lvlText w:val="o"/>
+      <w:lvlJc w:val="left"/>
+      <w:pPr>
+        <w:ind w:left="3960" w:hanging="360"/>
+      </w:pPr>
+      <w:rPr>
+        <w:rFonts w:ascii="Courier New" w:hAnsi="Courier New" w:cs="Courier New" w:hint="default"/>
+      </w:rPr>
+    </w:lvl>
+    <w:lvl w:ilvl="5" w:tplc="2C0A0005" w:tentative="1">
+      <w:start w:val="1"/>
+      <w:numFmt w:val="bullet"/>
+      <w:lvlText w:val=""/>
+      <w:lvlJc w:val="left"/>
+      <w:pPr>
+        <w:ind w:left="4680" w:hanging="360"/>
+      </w:pPr>
+      <w:rPr>
+        <w:rFonts w:ascii="Wingdings" w:hAnsi="Wingdings" w:hint="default"/>
+      </w:rPr>
+    </w:lvl>
+    <w:lvl w:ilvl="6" w:tplc="2C0A0001" w:tentative="1">
+      <w:start w:val="1"/>
+      <w:numFmt w:val="bullet"/>
+      <w:lvlText w:val=""/>
+      <w:lvlJc w:val="left"/>
+      <w:pPr>
+        <w:ind w:left="5400" w:hanging="360"/>
+      </w:pPr>
+      <w:rPr>
+        <w:rFonts w:ascii="Symbol" w:hAnsi="Symbol" w:hint="default"/>
+      </w:rPr>
+    </w:lvl>
+    <w:lvl w:ilvl="7" w:tplc="2C0A0003" w:tentative="1">
+      <w:start w:val="1"/>
+      <w:numFmt w:val="bullet"/>
+      <w:lvlText w:val="o"/>
+      <w:lvlJc w:val="left"/>
+      <w:pPr>
+        <w:ind w:left="6120" w:hanging="360"/>
+      </w:pPr>
+      <w:rPr>
+        <w:rFonts w:ascii="Courier New" w:hAnsi="Courier New" w:cs="Courier New" w:hint="default"/>
+      </w:rPr>
+    </w:lvl>
+    <w:lvl w:ilvl="8" w:tplc="2C0A0005" w:tentative="1">
+      <w:start w:val="1"/>
+      <w:numFmt w:val="bullet"/>
+      <w:lvlText w:val=""/>
+      <w:lvlJc w:val="left"/>
+      <w:pPr>
+        <w:ind w:left="6840" w:hanging="360"/>
+      </w:pPr>
+      <w:rPr>
+        <w:rFonts w:ascii="Wingdings" w:hAnsi="Wingdings" w:hint="default"/>
+      </w:rPr>
+    </w:lvl>
+  </w:abstractNum>
   <w:num w:numId="1">
+    <w:abstractNumId w:val="1"/>
+  </w:num>
+  <w:num w:numId="2">
+    <w:abstractNumId w:val="2"/>
+  </w:num>
+  <w:num w:numId="3">
     <w:abstractNumId w:val="0"/>
   </w:num>
 </w:numbering>
@@ -1192,18 +1302,25 @@
     <w:link w:val="Heading1Char"/>
     <w:uiPriority w:val="9"/>
     <w:qFormat/>
-    <w:rsid w:val="00721489"/>
+    <w:rsid w:val="00CE3C8F"/>
     <w:pPr>
       <w:keepNext/>
       <w:keepLines/>
       <w:spacing w:before="240" w:after="0"/>
+      <w:jc w:val="both"/>
       <w:outlineLvl w:val="0"/>
     </w:pPr>
     <w:rPr>
       <w:rFonts w:asciiTheme="majorHAnsi" w:eastAsiaTheme="majorEastAsia" w:hAnsiTheme="majorHAnsi" w:cstheme="majorBidi"/>
-      <w:color w:val="2F5496" w:themeColor="accent1" w:themeShade="BF"/>
+      <w:color w:val="000000" w:themeColor="text1"/>
       <w:sz w:val="32"/>
       <w:szCs w:val="32"/>
+      <w:lang w:val="es-AR"/>
+      <w14:textOutline w14:w="0" w14:cap="flat" w14:cmpd="sng" w14:algn="ctr">
+        <w14:noFill/>
+        <w14:prstDash w14:val="solid"/>
+        <w14:round/>
+      </w14:textOutline>
     </w:rPr>
   </w:style>
   <w:style w:type="character" w:default="1" w:styleId="DefaultParagraphFont">
@@ -1272,12 +1389,18 @@
     <w:basedOn w:val="DefaultParagraphFont"/>
     <w:link w:val="Heading1"/>
     <w:uiPriority w:val="9"/>
-    <w:rsid w:val="00721489"/>
+    <w:rsid w:val="00CE3C8F"/>
     <w:rPr>
       <w:rFonts w:asciiTheme="majorHAnsi" w:eastAsiaTheme="majorEastAsia" w:hAnsiTheme="majorHAnsi" w:cstheme="majorBidi"/>
-      <w:color w:val="2F5496" w:themeColor="accent1" w:themeShade="BF"/>
+      <w:color w:val="000000" w:themeColor="text1"/>
       <w:sz w:val="32"/>
       <w:szCs w:val="32"/>
+      <w:lang w:val="es-AR"/>
+      <w14:textOutline w14:w="0" w14:cap="flat" w14:cmpd="sng" w14:algn="ctr">
+        <w14:noFill/>
+        <w14:prstDash w14:val="solid"/>
+        <w14:round/>
+      </w14:textOutline>
     </w:rPr>
   </w:style>
   <w:style w:type="paragraph" w:styleId="ListParagraph">

</xml_diff>